<commit_message>
============ Final Report [Project 5] ============
</commit_message>
<xml_diff>
--- a/5. Feature selection with an adaptive multi-objective/Extras/MOBGA_AOS - Report.docx
+++ b/5. Feature selection with an adaptive multi-objective/Extras/MOBGA_AOS - Report.docx
@@ -5117,89 +5117,16 @@
           <w:noProof/>
         </w:rPr>
         <w:lastRenderedPageBreak/>
-        <w:drawing>
-          <wp:anchor distT="0" distB="0" distL="114300" distR="114300" simplePos="0" relativeHeight="251659264" behindDoc="0" locked="0" layoutInCell="1" allowOverlap="1" wp14:anchorId="09F3EE8E" wp14:editId="3EE94E6F">
-            <wp:simplePos x="0" y="0"/>
-            <wp:positionH relativeFrom="margin">
-              <wp:posOffset>-709295</wp:posOffset>
-            </wp:positionH>
-            <wp:positionV relativeFrom="paragraph">
-              <wp:posOffset>542290</wp:posOffset>
-            </wp:positionV>
-            <wp:extent cx="7359015" cy="5344795"/>
-            <wp:effectExtent l="0" t="0" r="0" b="8255"/>
-            <wp:wrapTopAndBottom/>
-            <wp:docPr id="1855470074" name="Picture 1"/>
-            <wp:cNvGraphicFramePr>
-              <a:graphicFrameLocks xmlns:a="http://schemas.openxmlformats.org/drawingml/2006/main" noChangeAspect="1"/>
-            </wp:cNvGraphicFramePr>
-            <a:graphic xmlns:a="http://schemas.openxmlformats.org/drawingml/2006/main">
-              <a:graphicData uri="http://schemas.openxmlformats.org/drawingml/2006/picture">
-                <pic:pic xmlns:pic="http://schemas.openxmlformats.org/drawingml/2006/picture">
-                  <pic:nvPicPr>
-                    <pic:cNvPr id="0" name="Picture 1"/>
-                    <pic:cNvPicPr>
-                      <a:picLocks noChangeAspect="1" noChangeArrowheads="1"/>
-                    </pic:cNvPicPr>
-                  </pic:nvPicPr>
-                  <pic:blipFill rotWithShape="1">
-                    <a:blip r:embed="rId9" cstate="print">
-                      <a:extLst>
-                        <a:ext uri="{28A0092B-C50C-407E-A947-70E740481C1C}">
-                          <a14:useLocalDpi xmlns:a14="http://schemas.microsoft.com/office/drawing/2010/main" val="0"/>
-                        </a:ext>
-                      </a:extLst>
-                    </a:blip>
-                    <a:srcRect t="26882"/>
-                    <a:stretch>
-                      <a:fillRect/>
-                    </a:stretch>
-                  </pic:blipFill>
-                  <pic:spPr bwMode="auto">
-                    <a:xfrm>
-                      <a:off x="0" y="0"/>
-                      <a:ext cx="7359015" cy="5344795"/>
-                    </a:xfrm>
-                    <a:prstGeom prst="rect">
-                      <a:avLst/>
-                    </a:prstGeom>
-                    <a:noFill/>
-                    <a:ln>
-                      <a:noFill/>
-                    </a:ln>
-                    <a:extLst>
-                      <a:ext uri="{53640926-AAD7-44D8-BBD7-CCE9431645EC}">
-                        <a14:shadowObscured xmlns:a14="http://schemas.microsoft.com/office/drawing/2010/main"/>
-                      </a:ext>
-                    </a:extLst>
-                  </pic:spPr>
-                </pic:pic>
-              </a:graphicData>
-            </a:graphic>
-            <wp14:sizeRelH relativeFrom="margin">
-              <wp14:pctWidth>0</wp14:pctWidth>
-            </wp14:sizeRelH>
-            <wp14:sizeRelV relativeFrom="margin">
-              <wp14:pctHeight>0</wp14:pctHeight>
-            </wp14:sizeRelV>
-          </wp:anchor>
-        </w:drawing>
-      </w:r>
-      <w:r>
-        <w:rPr>
-          <w:rFonts w:asciiTheme="majorBidi" w:hAnsiTheme="majorBidi" w:cstheme="majorBidi"/>
-          <w:noProof/>
-        </w:rPr>
         <mc:AlternateContent>
           <mc:Choice Requires="wps">
             <w:drawing>
-              <wp:anchor distT="0" distB="0" distL="114300" distR="114300" simplePos="0" relativeHeight="251661312" behindDoc="0" locked="0" layoutInCell="1" allowOverlap="1" wp14:anchorId="44B90A2E" wp14:editId="146E3D59">
+              <wp:anchor distT="0" distB="0" distL="114300" distR="114300" simplePos="0" relativeHeight="251661312" behindDoc="0" locked="0" layoutInCell="1" allowOverlap="1" wp14:anchorId="44B90A2E" wp14:editId="42474061">
                 <wp:simplePos x="0" y="0"/>
                 <wp:positionH relativeFrom="margin">
-                  <wp:align>right</wp:align>
+                  <wp:align>center</wp:align>
                 </wp:positionH>
                 <wp:positionV relativeFrom="paragraph">
-                  <wp:posOffset>5940767</wp:posOffset>
+                  <wp:posOffset>6385902</wp:posOffset>
                 </wp:positionV>
                 <wp:extent cx="6083935" cy="163830"/>
                 <wp:effectExtent l="0" t="0" r="0" b="7620"/>
@@ -5295,7 +5222,7 @@
                 <v:stroke joinstyle="miter"/>
                 <v:path gradientshapeok="t" o:connecttype="rect"/>
               </v:shapetype>
-              <v:shape id="Text Box 1" o:spid="_x0000_s1026" type="#_x0000_t202" style="position:absolute;left:0;text-align:left;margin-left:427.85pt;margin-top:467.8pt;width:479.05pt;height:12.9pt;z-index:251661312;visibility:visible;mso-wrap-style:square;mso-height-percent:0;mso-wrap-distance-left:9pt;mso-wrap-distance-top:0;mso-wrap-distance-right:9pt;mso-wrap-distance-bottom:0;mso-position-horizontal:right;mso-position-horizontal-relative:margin;mso-position-vertical:absolute;mso-position-vertical-relative:text;mso-height-percent:0;mso-height-relative:margin;v-text-anchor:top" o:gfxdata="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" stroked="f">
+              <v:shape id="Text Box 1" o:spid="_x0000_s1026" type="#_x0000_t202" style="position:absolute;left:0;text-align:left;margin-left:0;margin-top:502.85pt;width:479.05pt;height:12.9pt;z-index:251661312;visibility:visible;mso-wrap-style:square;mso-height-percent:0;mso-wrap-distance-left:9pt;mso-wrap-distance-top:0;mso-wrap-distance-right:9pt;mso-wrap-distance-bottom:0;mso-position-horizontal:center;mso-position-horizontal-relative:margin;mso-position-vertical:absolute;mso-position-vertical-relative:text;mso-height-percent:0;mso-height-relative:margin;v-text-anchor:top" o:gfxdata="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" stroked="f">
                 <v:textbox inset="0,0,0,0">
                   <w:txbxContent>
                     <w:p>
@@ -5350,6 +5277,79 @@
             </w:pict>
           </mc:Fallback>
         </mc:AlternateContent>
+      </w:r>
+      <w:r>
+        <w:rPr>
+          <w:rFonts w:asciiTheme="majorBidi" w:hAnsiTheme="majorBidi" w:cstheme="majorBidi"/>
+          <w:noProof/>
+        </w:rPr>
+        <w:drawing>
+          <wp:anchor distT="0" distB="0" distL="114300" distR="114300" simplePos="0" relativeHeight="251659264" behindDoc="0" locked="0" layoutInCell="1" allowOverlap="1" wp14:anchorId="09F3EE8E" wp14:editId="1126D242">
+            <wp:simplePos x="0" y="0"/>
+            <wp:positionH relativeFrom="margin">
+              <wp:align>center</wp:align>
+            </wp:positionH>
+            <wp:positionV relativeFrom="paragraph">
+              <wp:posOffset>452120</wp:posOffset>
+            </wp:positionV>
+            <wp:extent cx="5280025" cy="5820410"/>
+            <wp:effectExtent l="0" t="0" r="0" b="8890"/>
+            <wp:wrapTopAndBottom/>
+            <wp:docPr id="1855470074" name="Picture 1"/>
+            <wp:cNvGraphicFramePr>
+              <a:graphicFrameLocks xmlns:a="http://schemas.openxmlformats.org/drawingml/2006/main" noChangeAspect="1"/>
+            </wp:cNvGraphicFramePr>
+            <a:graphic xmlns:a="http://schemas.openxmlformats.org/drawingml/2006/main">
+              <a:graphicData uri="http://schemas.openxmlformats.org/drawingml/2006/picture">
+                <pic:pic xmlns:pic="http://schemas.openxmlformats.org/drawingml/2006/picture">
+                  <pic:nvPicPr>
+                    <pic:cNvPr id="1855470074" name="Picture 1"/>
+                    <pic:cNvPicPr>
+                      <a:picLocks noChangeAspect="1" noChangeArrowheads="1"/>
+                    </pic:cNvPicPr>
+                  </pic:nvPicPr>
+                  <pic:blipFill rotWithShape="1">
+                    <a:blip r:embed="rId9" cstate="print">
+                      <a:extLst>
+                        <a:ext uri="{28A0092B-C50C-407E-A947-70E740481C1C}">
+                          <a14:useLocalDpi xmlns:a14="http://schemas.microsoft.com/office/drawing/2010/main" val="0"/>
+                        </a:ext>
+                      </a:extLst>
+                    </a:blip>
+                    <a:srcRect t="790" b="64"/>
+                    <a:stretch>
+                      <a:fillRect/>
+                    </a:stretch>
+                  </pic:blipFill>
+                  <pic:spPr bwMode="auto">
+                    <a:xfrm>
+                      <a:off x="0" y="0"/>
+                      <a:ext cx="5280025" cy="5820410"/>
+                    </a:xfrm>
+                    <a:prstGeom prst="rect">
+                      <a:avLst/>
+                    </a:prstGeom>
+                    <a:noFill/>
+                    <a:ln>
+                      <a:noFill/>
+                    </a:ln>
+                    <a:extLst>
+                      <a:ext uri="{53640926-AAD7-44D8-BBD7-CCE9431645EC}">
+                        <a14:shadowObscured xmlns:a14="http://schemas.microsoft.com/office/drawing/2010/main"/>
+                      </a:ext>
+                    </a:extLst>
+                  </pic:spPr>
+                </pic:pic>
+              </a:graphicData>
+            </a:graphic>
+            <wp14:sizeRelH relativeFrom="margin">
+              <wp14:pctWidth>0</wp14:pctWidth>
+            </wp14:sizeRelH>
+            <wp14:sizeRelV relativeFrom="margin">
+              <wp14:pctHeight>0</wp14:pctHeight>
+            </wp14:sizeRelV>
+          </wp:anchor>
+        </w:drawing>
       </w:r>
       <w:r>
         <w:rPr>
@@ -6898,7 +6898,7 @@
           <w:noProof/>
         </w:rPr>
         <w:drawing>
-          <wp:inline distT="0" distB="0" distL="0" distR="0" wp14:anchorId="5E4EED47" wp14:editId="0295485D">
+          <wp:inline distT="0" distB="0" distL="0" distR="0" wp14:anchorId="5E4EED47" wp14:editId="4E3CE4EA">
             <wp:extent cx="4572000" cy="3180655"/>
             <wp:effectExtent l="0" t="0" r="0" b="1270"/>
             <wp:docPr id="170814315" name="pareto_DS07"/>
@@ -6966,7 +6966,7 @@
         </w:rPr>
         <w:lastRenderedPageBreak/>
         <w:drawing>
-          <wp:inline distT="0" distB="0" distL="0" distR="0" wp14:anchorId="15BED8E9" wp14:editId="13AA2D37">
+          <wp:inline distT="0" distB="0" distL="0" distR="0" wp14:anchorId="15BED8E9" wp14:editId="678757B7">
             <wp:extent cx="4572000" cy="3180655"/>
             <wp:effectExtent l="0" t="0" r="0" b="1270"/>
             <wp:docPr id="1623613927" name="pareto_DS08"/>
@@ -7033,7 +7033,7 @@
           <w:noProof/>
         </w:rPr>
         <w:drawing>
-          <wp:inline distT="0" distB="0" distL="0" distR="0" wp14:anchorId="2F5D7B33" wp14:editId="734E0888">
+          <wp:inline distT="0" distB="0" distL="0" distR="0" wp14:anchorId="2F5D7B33" wp14:editId="427D99F0">
             <wp:extent cx="4572000" cy="3177570"/>
             <wp:effectExtent l="0" t="0" r="0" b="3810"/>
             <wp:docPr id="2091169596" name="pareto_DS10"/>
@@ -8113,6 +8113,7 @@
   <w:style w:type="character" w:default="1" w:styleId="DefaultParagraphFont">
     <w:name w:val="Default Paragraph Font"/>
     <w:uiPriority w:val="1"/>
+    <w:semiHidden/>
     <w:unhideWhenUsed/>
   </w:style>
   <w:style w:type="table" w:default="1" w:styleId="TableNormal">

</xml_diff>